<commit_message>
Report: compare and tune with cross-validation, test set only for the final evaluation
</commit_message>
<xml_diff>
--- a/reports/Lab2_Report_Group28.docx
+++ b/reports/Lab2_Report_Group28.docx
@@ -116,11 +116,7 @@
     </w:p>
     <w:p>
       <w:r>
-        <w:t xml:space="preserve">The most important thing we found was data leakage. PRICE RANGE is made from the price, so PRICE($) more or less tells the model the answer. What surprised us was that the price ranges of the classes overlap: a Low car can cost up to $61,000 and a Luxury car as little as $33,000. When we </w:t>
-      </w:r>
-      <w:r>
-        <w:lastRenderedPageBreak/>
-        <w:t>looked closer, we saw that inside each car type the four classes are about 25% each, and that the simple rule “rank the price among cars of the same type and cut it into four equal parts” gives the correct class for 82.1% of the listings. So the class actually means how expensive a car is compared with other cars of the same type. A random forest that only gets the car type and the price reaches 88.0% accuracy (notebook section 7.4), far more than anything we got from the other features. That model would be useless in practice, because the whole point is to estimate the price class without knowing the price, so PRICE($) was removed.</w:t>
+        <w:t xml:space="preserve">The most important thing we found was data leakage. PRICE RANGE is made from the price, so PRICE($) more or less tells the model the answer. What surprised us was that the price ranges of the classes overlap: a Low car can cost up to $61,000 and a Luxury car as little as $33,000. When we looked closer, we saw that inside each car type the four classes are about 25% each, and that the simple rule “rank the price among cars of the same type and cut it into four equal parts” gives the correct class for 82.1% of the listings. So the class actually means how expensive a car is compared with other cars of the same type. A random forest that only gets the car type and the price reaches 88.0% accuracy (notebook section 7.5), far more than anything we got from the other features. That model would be useless in practice, because the whole point is to estimate the price class without knowing the price, so PRICE($) was removed.</w:t>
       </w:r>
     </w:p>
     <w:p>
@@ -205,11 +201,7 @@
     </w:p>
     <w:p>
       <w:r>
-        <w:t xml:space="preserve">Before fitting any model we split the data into a training set (32,000 listings) and a test set (8,000 listings). The split is stratified, so every class has the same share in both sets. The test set was only </w:t>
-      </w:r>
-      <w:r>
-        <w:lastRenderedPageBreak/>
-        <w:t>used for the final evaluation. For comparing models and tuning we used 5-fold cross-validation on the training set, which scikit-learn also stratifies for classifiers.</w:t>
+        <w:t xml:space="preserve">Before fitting any model we split the data into a training set (32,000 listings) and a test set (8,000 listings). The split is stratified, so every class has the same share in both sets. The test set was only used for the final evaluation. For comparing models and tuning we used 5-fold cross-validation on the training set, which scikit-learn also stratifies for classifiers.</w:t>
       </w:r>
     </w:p>
     <w:p>
@@ -222,7 +214,7 @@
     </w:p>
     <w:p>
       <w:r>
-        <w:t>All models were trained on the same data with the same preprocessing. We report accuracy, precision, recall and F1 as defined in Lecture 3 (Tarlani, 2026). For precision, recall and F1 we use the macro average, the plain mean of the four class scores, because it treats every class as equally important, which fits the question of which classes are easy and which are hard. Since the classes are balanced, the weighted average gives almost the same numbers. The lab instructions only suggest ROC-AUC for binary problems, so we didn’t use it. Table 1 shows all models on the test set, including the tuned ones from section 3.2.</w:t>
+        <w:t>All models were trained on the same data with the same preprocessing. We report accuracy, precision, recall and F1 as defined in Lecture 3 (Tarlani, 2026). For precision, recall and F1 we use the macro average, the plain mean of the four class scores, because it treats every class as equally important, which fits the question of which classes are easy and which are hard. Since the classes are balanced, the weighted average gives almost the same numbers. The lab instructions only suggest ROC-AUC for binary problems, so we didn’t use it. As the lab instructions ask, we compared and tuned the models with 5-fold cross-validation on the training set only. Table 1 shows the mean cross-validation results before and after tuning (section 3.2). The test set was only used at the end, for the two selected models (section 3.3).</w:t>
       </w:r>
     </w:p>
     <w:p>
@@ -237,7 +229,7 @@
         <w:t xml:space="preserve">Table 1. </w:t>
       </w:r>
       <w:r>
-        <w:t>Results on the test set (8,000 listings). Precision, recall and F1 are macro averages, and the best value in each column is in bold.</w:t>
+        <w:t>Five-fold cross-validation results on the training set (32,000 listings), before and after tuning. Precision, recall and F1 are macro averages, and the best value in each column is in bold.</w:t>
       </w:r>
     </w:p>
     <w:tbl>
@@ -671,7 +663,7 @@
                 <w:sz w:val="20"/>
                 <w:szCs w:val="20"/>
               </w:rPr>
-              <w:t>0.577</w:t>
+              <w:t>0.580</w:t>
             </w:r>
           </w:p>
         </w:tc>
@@ -703,7 +695,7 @@
                 <w:sz w:val="20"/>
                 <w:szCs w:val="20"/>
               </w:rPr>
-              <w:t>0.561</w:t>
+              <w:t>0.565</w:t>
             </w:r>
           </w:p>
         </w:tc>
@@ -735,7 +727,7 @@
                 <w:sz w:val="20"/>
                 <w:szCs w:val="20"/>
               </w:rPr>
-              <w:t>0.572</w:t>
+              <w:t>0.575</w:t>
             </w:r>
           </w:p>
         </w:tc>
@@ -767,7 +759,7 @@
                 <w:sz w:val="20"/>
                 <w:szCs w:val="20"/>
               </w:rPr>
-              <w:t>0.562</w:t>
+              <w:t>0.564</w:t>
             </w:r>
           </w:p>
         </w:tc>
@@ -836,6 +828,70 @@
                 <w:sz w:val="20"/>
                 <w:szCs w:val="20"/>
               </w:rPr>
+              <w:t>0.581</w:t>
+            </w:r>
+          </w:p>
+        </w:tc>
+        <w:tc>
+          <w:tcPr>
+            <w:tcW w:w="1250" w:type="dxa"/>
+            <w:tcBorders>
+              <w:top w:val="single" w:sz="4" w:space="0" w:color="BFBFBF"/>
+              <w:left w:val="none" w:sz="0" w:space="0" w:color="FFFFFF"/>
+              <w:bottom w:val="single" w:sz="4" w:space="0" w:color="BFBFBF"/>
+              <w:right w:val="none" w:sz="0" w:space="0" w:color="FFFFFF"/>
+            </w:tcBorders>
+            <w:tcMar>
+              <w:top w:w="50" w:type="dxa"/>
+              <w:left w:w="110" w:type="dxa"/>
+              <w:bottom w:w="50" w:type="dxa"/>
+              <w:right w:w="110" w:type="dxa"/>
+            </w:tcMar>
+            <w:vAlign w:val="center"/>
+          </w:tcPr>
+          <w:p>
+            <w:pPr>
+              <w:keepNext/>
+              <w:spacing w:after="0" w:line="240" w:lineRule="auto"/>
+              <w:jc w:val="center"/>
+            </w:pPr>
+            <w:r>
+              <w:rPr>
+                <w:sz w:val="20"/>
+                <w:szCs w:val="20"/>
+              </w:rPr>
+              <w:t>0.568</w:t>
+            </w:r>
+          </w:p>
+        </w:tc>
+        <w:tc>
+          <w:tcPr>
+            <w:tcW w:w="1250" w:type="dxa"/>
+            <w:tcBorders>
+              <w:top w:val="single" w:sz="4" w:space="0" w:color="BFBFBF"/>
+              <w:left w:val="none" w:sz="0" w:space="0" w:color="FFFFFF"/>
+              <w:bottom w:val="single" w:sz="4" w:space="0" w:color="BFBFBF"/>
+              <w:right w:val="none" w:sz="0" w:space="0" w:color="FFFFFF"/>
+            </w:tcBorders>
+            <w:tcMar>
+              <w:top w:w="50" w:type="dxa"/>
+              <w:left w:w="110" w:type="dxa"/>
+              <w:bottom w:w="50" w:type="dxa"/>
+              <w:right w:w="110" w:type="dxa"/>
+            </w:tcMar>
+            <w:vAlign w:val="center"/>
+          </w:tcPr>
+          <w:p>
+            <w:pPr>
+              <w:keepNext/>
+              <w:spacing w:after="0" w:line="240" w:lineRule="auto"/>
+              <w:jc w:val="center"/>
+            </w:pPr>
+            <w:r>
+              <w:rPr>
+                <w:sz w:val="20"/>
+                <w:szCs w:val="20"/>
+              </w:rPr>
               <w:t>0.576</w:t>
             </w:r>
           </w:p>
@@ -868,71 +924,7 @@
                 <w:sz w:val="20"/>
                 <w:szCs w:val="20"/>
               </w:rPr>
-              <w:t>0.562</w:t>
-            </w:r>
-          </w:p>
-        </w:tc>
-        <w:tc>
-          <w:tcPr>
-            <w:tcW w:w="1250" w:type="dxa"/>
-            <w:tcBorders>
-              <w:top w:val="single" w:sz="4" w:space="0" w:color="BFBFBF"/>
-              <w:left w:val="none" w:sz="0" w:space="0" w:color="FFFFFF"/>
-              <w:bottom w:val="single" w:sz="4" w:space="0" w:color="BFBFBF"/>
-              <w:right w:val="none" w:sz="0" w:space="0" w:color="FFFFFF"/>
-            </w:tcBorders>
-            <w:tcMar>
-              <w:top w:w="50" w:type="dxa"/>
-              <w:left w:w="110" w:type="dxa"/>
-              <w:bottom w:w="50" w:type="dxa"/>
-              <w:right w:w="110" w:type="dxa"/>
-            </w:tcMar>
-            <w:vAlign w:val="center"/>
-          </w:tcPr>
-          <w:p>
-            <w:pPr>
-              <w:keepNext/>
-              <w:spacing w:after="0" w:line="240" w:lineRule="auto"/>
-              <w:jc w:val="center"/>
-            </w:pPr>
-            <w:r>
-              <w:rPr>
-                <w:sz w:val="20"/>
-                <w:szCs w:val="20"/>
-              </w:rPr>
-              <w:t>0.571</w:t>
-            </w:r>
-          </w:p>
-        </w:tc>
-        <w:tc>
-          <w:tcPr>
-            <w:tcW w:w="1250" w:type="dxa"/>
-            <w:tcBorders>
-              <w:top w:val="single" w:sz="4" w:space="0" w:color="BFBFBF"/>
-              <w:left w:val="none" w:sz="0" w:space="0" w:color="FFFFFF"/>
-              <w:bottom w:val="single" w:sz="4" w:space="0" w:color="BFBFBF"/>
-              <w:right w:val="none" w:sz="0" w:space="0" w:color="FFFFFF"/>
-            </w:tcBorders>
-            <w:tcMar>
-              <w:top w:w="50" w:type="dxa"/>
-              <w:left w:w="110" w:type="dxa"/>
-              <w:bottom w:w="50" w:type="dxa"/>
-              <w:right w:w="110" w:type="dxa"/>
-            </w:tcMar>
-            <w:vAlign w:val="center"/>
-          </w:tcPr>
-          <w:p>
-            <w:pPr>
-              <w:keepNext/>
-              <w:spacing w:after="0" w:line="240" w:lineRule="auto"/>
-              <w:jc w:val="center"/>
-            </w:pPr>
-            <w:r>
-              <w:rPr>
-                <w:sz w:val="20"/>
-                <w:szCs w:val="20"/>
-              </w:rPr>
-              <w:t>0.563</w:t>
+              <w:t>0.567</w:t>
             </w:r>
           </w:p>
         </w:tc>
@@ -1001,7 +993,7 @@
                 <w:sz w:val="20"/>
                 <w:szCs w:val="20"/>
               </w:rPr>
-              <w:t>0.637</w:t>
+              <w:t>0.635</w:t>
             </w:r>
           </w:p>
         </w:tc>
@@ -1033,6 +1025,38 @@
                 <w:sz w:val="20"/>
                 <w:szCs w:val="20"/>
               </w:rPr>
+              <w:t>0.629</w:t>
+            </w:r>
+          </w:p>
+        </w:tc>
+        <w:tc>
+          <w:tcPr>
+            <w:tcW w:w="1250" w:type="dxa"/>
+            <w:tcBorders>
+              <w:top w:val="single" w:sz="4" w:space="0" w:color="BFBFBF"/>
+              <w:left w:val="none" w:sz="0" w:space="0" w:color="FFFFFF"/>
+              <w:bottom w:val="single" w:sz="4" w:space="0" w:color="BFBFBF"/>
+              <w:right w:val="none" w:sz="0" w:space="0" w:color="FFFFFF"/>
+            </w:tcBorders>
+            <w:tcMar>
+              <w:top w:w="50" w:type="dxa"/>
+              <w:left w:w="110" w:type="dxa"/>
+              <w:bottom w:w="50" w:type="dxa"/>
+              <w:right w:w="110" w:type="dxa"/>
+            </w:tcMar>
+            <w:vAlign w:val="center"/>
+          </w:tcPr>
+          <w:p>
+            <w:pPr>
+              <w:keepNext/>
+              <w:spacing w:after="0" w:line="240" w:lineRule="auto"/>
+              <w:jc w:val="center"/>
+            </w:pPr>
+            <w:r>
+              <w:rPr>
+                <w:sz w:val="20"/>
+                <w:szCs w:val="20"/>
+              </w:rPr>
               <w:t>0.632</w:t>
             </w:r>
           </w:p>
@@ -1065,39 +1089,7 @@
                 <w:sz w:val="20"/>
                 <w:szCs w:val="20"/>
               </w:rPr>
-              <w:t>0.635</w:t>
-            </w:r>
-          </w:p>
-        </w:tc>
-        <w:tc>
-          <w:tcPr>
-            <w:tcW w:w="1250" w:type="dxa"/>
-            <w:tcBorders>
-              <w:top w:val="single" w:sz="4" w:space="0" w:color="BFBFBF"/>
-              <w:left w:val="none" w:sz="0" w:space="0" w:color="FFFFFF"/>
-              <w:bottom w:val="single" w:sz="4" w:space="0" w:color="BFBFBF"/>
-              <w:right w:val="none" w:sz="0" w:space="0" w:color="FFFFFF"/>
-            </w:tcBorders>
-            <w:tcMar>
-              <w:top w:w="50" w:type="dxa"/>
-              <w:left w:w="110" w:type="dxa"/>
-              <w:bottom w:w="50" w:type="dxa"/>
-              <w:right w:w="110" w:type="dxa"/>
-            </w:tcMar>
-            <w:vAlign w:val="center"/>
-          </w:tcPr>
-          <w:p>
-            <w:pPr>
-              <w:keepNext/>
-              <w:spacing w:after="0" w:line="240" w:lineRule="auto"/>
-              <w:jc w:val="center"/>
-            </w:pPr>
-            <w:r>
-              <w:rPr>
-                <w:sz w:val="20"/>
-                <w:szCs w:val="20"/>
-              </w:rPr>
-              <w:t>0.633</w:t>
+              <w:t>0.630</w:t>
             </w:r>
           </w:p>
         </w:tc>
@@ -1168,7 +1160,7 @@
                 <w:sz w:val="20"/>
                 <w:szCs w:val="20"/>
               </w:rPr>
-              <w:t>0.642</w:t>
+              <w:t>0.640</w:t>
             </w:r>
           </w:p>
         </w:tc>
@@ -1202,7 +1194,7 @@
                 <w:sz w:val="20"/>
                 <w:szCs w:val="20"/>
               </w:rPr>
-              <w:t>0.638</w:t>
+              <w:t>0.635</w:t>
             </w:r>
           </w:p>
         </w:tc>
@@ -1236,7 +1228,7 @@
                 <w:sz w:val="20"/>
                 <w:szCs w:val="20"/>
               </w:rPr>
-              <w:t>0.639</w:t>
+              <w:t>0.637</w:t>
             </w:r>
           </w:p>
         </w:tc>
@@ -1270,7 +1262,7 @@
                 <w:sz w:val="20"/>
                 <w:szCs w:val="20"/>
               </w:rPr>
-              <w:t>0.639</w:t>
+              <w:t>0.635</w:t>
             </w:r>
           </w:p>
         </w:tc>
@@ -1283,12 +1275,12 @@
     </w:p>
     <w:p>
       <w:r>
-        <w:t>The dummy model always predicts Luxury, the largest class, and is right 26.4% of the time, which is about what you get by guessing. Its macro F1 is only 0.104, because it never predicts the other three classes. Logistic regression more than doubles the accuracy, to 57.7%, and the random forest reaches 63.7%, or 64.2% after tuning. With four classes, 64% may not sound very high, but most of the mistakes are near misses: 81% of the wrong predictions of the tuned forest are only one class away from the right one, for example High predicted as Luxury (78% for logistic regression). We come back to this in section 4.</w:t>
-      </w:r>
-    </w:p>
-    <w:p>
-      <w:r>
-        <w:t>Cross-validation on the training set gave almost the same picture as the test set, with an accuracy of 0.580 for logistic regression and 0.635 for the forest, and the standard deviation of the macro F1 over the five folds was below 0.01 for both models. So we don’t think the difference between the models comes from a lucky split.</w:t>
+        <w:t>The dummy model always predicts Luxury, the largest class, and is right 26.4% of the time, which is about what you get by guessing. Its macro F1 is only 0.104, because it never predicts the other three classes. Logistic regression more than doubles the accuracy, to 58.0%, and the random forest reaches 63.5%, or 64.0% after tuning.</w:t>
+      </w:r>
+    </w:p>
+    <w:p>
+      <w:r>
+        <w:t>The standard deviation of the macro F1 over the five folds was below 0.01 for both models (0.005 for logistic regression and 0.007 for the forest), so we don’t think the difference between the models comes from a lucky split.</w:t>
       </w:r>
     </w:p>
     <w:p>
@@ -1301,7 +1293,7 @@
     </w:p>
     <w:p>
       <w:r>
-        <w:t>The tuned logistic regression gets 59.0% accuracy on the training data and 57.6% on the test data. The two are close and neither is high, so the model is underfitting: it is too simple for the problem. The tuned random forest gets 82.1% on the training data and 64.2% on the test data. That gap of 18 percentage points shows that it overfits quite a lot, even with min_samples_leaf = 3, which stops the leaves from getting very small. Its test score is still clearly the best, though, and that is the number that matters for new listings.</w:t>
+        <w:t>In cross-validation, logistic regression gets 58.8% accuracy on the training folds and 58.0% on the validation folds. The two are close and neither is high, so the model is underfitting: it is too simple for the problem. The default random forest gets 92.5% on the training folds but only 63.5% on the validation folds. That gap of 29 percentage points shows that it overfits a lot, because its trees can grow until a leaf holds a single car. Its validation score is still clearly the best, though, and larger leaves make the gap smaller (sections 3.2 and 3.3).</w:t>
       </w:r>
     </w:p>
     <w:p>
@@ -1314,16 +1306,756 @@
     </w:p>
     <w:p>
       <w:r>
-        <w:t xml:space="preserve">For logistic regression we tuned C, which controls how strongly the model is regularised (a small C means strong regularisation). The grid search tried 0.01, 0.1, 1 and 10 and picked C = 10, the weakest regularisation, but the result hardly changed (cross-validation macro F1 0.564 before and 0.567 </w:t>
-      </w:r>
-      <w:r>
-        <w:lastRenderedPageBreak/>
-        <w:t>after, test accuracy 0.577 and 0.576). Just like Ridge in Lab 1, this makes sense: regularisation fights overfitting, and our linear model has the opposite problem.</w:t>
-      </w:r>
-    </w:p>
-    <w:p>
-      <w:r>
-        <w:t>For the random forest we tried 100 and 300 trees, max_features = sqrt or 0.3 (how many of the 169 columns each split may look at, about 13 or about 50), and min_samples_leaf = 1 or 3. The best combination was 300 trees, max_features = 0.3 and min_samples_leaf = 3. The cross-validation macro F1 went from 0.630 to 0.635, and on the test set the accuracy went from 0.637 to 0.642 and the macro F1 from 0.633 to 0.639. That is a small but consistent gain. Letting each split look at more columns (0.3 instead of sqrt) helped the most. Interestingly, bigger leaves only helped together with max_features = 0.3; with sqrt they made the forest worse (0.616 to 0.618). With 300 trees the forest scored almost the same as with 100 (0.635 against 0.634), but each fit took about 118 seconds instead of 34 during the grid search, so in practice 100 trees would be enough.</w:t>
+        <w:t xml:space="preserve">For logistic regression we tuned C, which controls how strongly the model is regularised (a small C means strong regularisation). The grid search tried 0.01, 0.1, 1 and 10 and picked C = 10, the weakest regularisation, but the result hardly changed (cross-validation macro F1 0.564 before and 0.567 after, accuracy 0.580 and 0.581). Just like Ridge in Lab 1, this makes sense: regularisation fights overfitting, and our linear model has the opposite problem.</w:t>
+      </w:r>
+    </w:p>
+    <w:p>
+      <w:r>
+        <w:t>For the random forest we tried 100 and 300 trees, max_features = sqrt or 0.3 (how many of the 169 columns each split may look at, about 13 or about 50), and min_samples_leaf = 1 or 3. The best combination was 300 trees, max_features = 0.3 and min_samples_leaf = 3. The cross-validation macro F1 went from 0.630 to 0.635 and the accuracy from 0.635 to 0.640. That is a small but consistent gain. Letting each split look at more columns (0.3 instead of sqrt) helped the most. Interestingly, bigger leaves only helped together with max_features = 0.3; with sqrt they made the forest worse (0.616 to 0.618). With 300 trees the forest scored almost the same as with 100 (0.635 against 0.634), but each fit took about 69 seconds instead of 30 during the grid search, so in practice 100 trees would be enough.</w:t>
+      </w:r>
+    </w:p>
+    <w:p>
+      <w:pPr>
+        <w:pStyle w:val="Heading2"/>
+      </w:pPr>
+      <w:r>
+        <w:t>3.3 Final evaluation on the test set</w:t>
+      </w:r>
+    </w:p>
+    <w:p>
+      <w:r>
+        <w:t xml:space="preserve">Based on cross-validation alone we selected the two tuned models: logistic regression with C = 10, and the random forest with 300 trees, max_features = 0.3 and min_samples_leaf = 3, which had the highest cross-validation macro F1 of all models (0.635). Only then did we evaluate them, once, on the held-out test set. Table 2 shows the results, with the dummy model as a reference.</w:t>
+      </w:r>
+    </w:p>
+    <w:p>
+      <w:pPr>
+        <w:pStyle w:val="Caption"/>
+      </w:pPr>
+      <w:r>
+        <w:rPr>
+          <w:b/>
+          <w:bCs/>
+        </w:rPr>
+        <w:t xml:space="preserve">Table 2. </w:t>
+      </w:r>
+      <w:r>
+        <w:t>Results of the selected models on the held-out test set (8,000 listings). Precision, recall and F1 are macro averages, and the best value in each column is in bold.</w:t>
+      </w:r>
+    </w:p>
+    <w:tbl>
+      <w:tblPr>
+        <w:tblW w:w="8100" w:type="dxa"/>
+        <w:jc w:val="center"/>
+        <w:tblBorders>
+          <w:top w:val="single" w:sz="4" w:space="0" w:color="auto"/>
+          <w:left w:val="single" w:sz="4" w:space="0" w:color="auto"/>
+          <w:bottom w:val="single" w:sz="4" w:space="0" w:color="auto"/>
+          <w:right w:val="single" w:sz="4" w:space="0" w:color="auto"/>
+          <w:insideH w:val="single" w:sz="4" w:space="0" w:color="auto"/>
+          <w:insideV w:val="single" w:sz="4" w:space="0" w:color="auto"/>
+        </w:tblBorders>
+        <w:tblLook w:val="04A0" w:firstRow="1" w:lastRow="0" w:firstColumn="1" w:lastColumn="0" w:noHBand="0" w:noVBand="1"/>
+      </w:tblPr>
+      <w:tblGrid>
+        <w:gridCol w:w="3100"/>
+        <w:gridCol w:w="1250"/>
+        <w:gridCol w:w="1250"/>
+        <w:gridCol w:w="1250"/>
+        <w:gridCol w:w="1250"/>
+      </w:tblGrid>
+      <w:tr>
+        <w:trPr>
+          <w:cantSplit/>
+          <w:tblHeader/>
+          <w:jc w:val="center"/>
+        </w:trPr>
+        <w:tc>
+          <w:tcPr>
+            <w:tcW w:w="3100" w:type="dxa"/>
+            <w:tcBorders>
+              <w:top w:val="single" w:sz="4" w:space="0" w:color="BFBFBF"/>
+              <w:left w:val="none" w:sz="0" w:space="0" w:color="FFFFFF"/>
+              <w:bottom w:val="single" w:sz="4" w:space="0" w:color="BFBFBF"/>
+              <w:right w:val="none" w:sz="0" w:space="0" w:color="FFFFFF"/>
+            </w:tcBorders>
+            <w:shd w:val="clear" w:color="auto" w:fill="EDEFF3"/>
+            <w:tcMar>
+              <w:top w:w="50" w:type="dxa"/>
+              <w:left w:w="110" w:type="dxa"/>
+              <w:bottom w:w="50" w:type="dxa"/>
+              <w:right w:w="110" w:type="dxa"/>
+            </w:tcMar>
+            <w:vAlign w:val="center"/>
+          </w:tcPr>
+          <w:p>
+            <w:pPr>
+              <w:keepNext/>
+              <w:spacing w:after="0" w:line="240" w:lineRule="auto"/>
+            </w:pPr>
+            <w:r>
+              <w:rPr>
+                <w:b/>
+                <w:bCs/>
+                <w:sz w:val="20"/>
+                <w:szCs w:val="20"/>
+              </w:rPr>
+              <w:t>Model</w:t>
+            </w:r>
+          </w:p>
+        </w:tc>
+        <w:tc>
+          <w:tcPr>
+            <w:tcW w:w="1250" w:type="dxa"/>
+            <w:tcBorders>
+              <w:top w:val="single" w:sz="4" w:space="0" w:color="BFBFBF"/>
+              <w:left w:val="none" w:sz="0" w:space="0" w:color="FFFFFF"/>
+              <w:bottom w:val="single" w:sz="4" w:space="0" w:color="BFBFBF"/>
+              <w:right w:val="none" w:sz="0" w:space="0" w:color="FFFFFF"/>
+            </w:tcBorders>
+            <w:shd w:val="clear" w:color="auto" w:fill="EDEFF3"/>
+            <w:tcMar>
+              <w:top w:w="50" w:type="dxa"/>
+              <w:left w:w="110" w:type="dxa"/>
+              <w:bottom w:w="50" w:type="dxa"/>
+              <w:right w:w="110" w:type="dxa"/>
+            </w:tcMar>
+            <w:vAlign w:val="center"/>
+          </w:tcPr>
+          <w:p>
+            <w:pPr>
+              <w:keepNext/>
+              <w:spacing w:after="0" w:line="240" w:lineRule="auto"/>
+              <w:jc w:val="center"/>
+            </w:pPr>
+            <w:r>
+              <w:rPr>
+                <w:b/>
+                <w:bCs/>
+                <w:sz w:val="20"/>
+                <w:szCs w:val="20"/>
+              </w:rPr>
+              <w:t>Accuracy</w:t>
+            </w:r>
+          </w:p>
+        </w:tc>
+        <w:tc>
+          <w:tcPr>
+            <w:tcW w:w="1250" w:type="dxa"/>
+            <w:tcBorders>
+              <w:top w:val="single" w:sz="4" w:space="0" w:color="BFBFBF"/>
+              <w:left w:val="none" w:sz="0" w:space="0" w:color="FFFFFF"/>
+              <w:bottom w:val="single" w:sz="4" w:space="0" w:color="BFBFBF"/>
+              <w:right w:val="none" w:sz="0" w:space="0" w:color="FFFFFF"/>
+            </w:tcBorders>
+            <w:shd w:val="clear" w:color="auto" w:fill="EDEFF3"/>
+            <w:tcMar>
+              <w:top w:w="50" w:type="dxa"/>
+              <w:left w:w="110" w:type="dxa"/>
+              <w:bottom w:w="50" w:type="dxa"/>
+              <w:right w:w="110" w:type="dxa"/>
+            </w:tcMar>
+            <w:vAlign w:val="center"/>
+          </w:tcPr>
+          <w:p>
+            <w:pPr>
+              <w:keepNext/>
+              <w:spacing w:after="0" w:line="240" w:lineRule="auto"/>
+              <w:jc w:val="center"/>
+            </w:pPr>
+            <w:r>
+              <w:rPr>
+                <w:b/>
+                <w:bCs/>
+                <w:sz w:val="20"/>
+                <w:szCs w:val="20"/>
+              </w:rPr>
+              <w:t>Precision</w:t>
+            </w:r>
+          </w:p>
+        </w:tc>
+        <w:tc>
+          <w:tcPr>
+            <w:tcW w:w="1250" w:type="dxa"/>
+            <w:tcBorders>
+              <w:top w:val="single" w:sz="4" w:space="0" w:color="BFBFBF"/>
+              <w:left w:val="none" w:sz="0" w:space="0" w:color="FFFFFF"/>
+              <w:bottom w:val="single" w:sz="4" w:space="0" w:color="BFBFBF"/>
+              <w:right w:val="none" w:sz="0" w:space="0" w:color="FFFFFF"/>
+            </w:tcBorders>
+            <w:shd w:val="clear" w:color="auto" w:fill="EDEFF3"/>
+            <w:tcMar>
+              <w:top w:w="50" w:type="dxa"/>
+              <w:left w:w="110" w:type="dxa"/>
+              <w:bottom w:w="50" w:type="dxa"/>
+              <w:right w:w="110" w:type="dxa"/>
+            </w:tcMar>
+            <w:vAlign w:val="center"/>
+          </w:tcPr>
+          <w:p>
+            <w:pPr>
+              <w:keepNext/>
+              <w:spacing w:after="0" w:line="240" w:lineRule="auto"/>
+              <w:jc w:val="center"/>
+            </w:pPr>
+            <w:r>
+              <w:rPr>
+                <w:b/>
+                <w:bCs/>
+                <w:sz w:val="20"/>
+                <w:szCs w:val="20"/>
+              </w:rPr>
+              <w:t>Recall</w:t>
+            </w:r>
+          </w:p>
+        </w:tc>
+        <w:tc>
+          <w:tcPr>
+            <w:tcW w:w="1250" w:type="dxa"/>
+            <w:tcBorders>
+              <w:top w:val="single" w:sz="4" w:space="0" w:color="BFBFBF"/>
+              <w:left w:val="none" w:sz="0" w:space="0" w:color="FFFFFF"/>
+              <w:bottom w:val="single" w:sz="4" w:space="0" w:color="BFBFBF"/>
+              <w:right w:val="none" w:sz="0" w:space="0" w:color="FFFFFF"/>
+            </w:tcBorders>
+            <w:shd w:val="clear" w:color="auto" w:fill="EDEFF3"/>
+            <w:tcMar>
+              <w:top w:w="50" w:type="dxa"/>
+              <w:left w:w="110" w:type="dxa"/>
+              <w:bottom w:w="50" w:type="dxa"/>
+              <w:right w:w="110" w:type="dxa"/>
+            </w:tcMar>
+            <w:vAlign w:val="center"/>
+          </w:tcPr>
+          <w:p>
+            <w:pPr>
+              <w:keepNext/>
+              <w:spacing w:after="0" w:line="240" w:lineRule="auto"/>
+              <w:jc w:val="center"/>
+            </w:pPr>
+            <w:r>
+              <w:rPr>
+                <w:b/>
+                <w:bCs/>
+                <w:sz w:val="20"/>
+                <w:szCs w:val="20"/>
+              </w:rPr>
+              <w:t>F1</w:t>
+            </w:r>
+          </w:p>
+        </w:tc>
+      </w:tr>
+      <w:tr>
+        <w:trPr>
+          <w:cantSplit/>
+          <w:jc w:val="center"/>
+        </w:trPr>
+        <w:tc>
+          <w:tcPr>
+            <w:tcW w:w="3100" w:type="dxa"/>
+            <w:tcBorders>
+              <w:top w:val="single" w:sz="4" w:space="0" w:color="BFBFBF"/>
+              <w:left w:val="none" w:sz="0" w:space="0" w:color="FFFFFF"/>
+              <w:bottom w:val="single" w:sz="4" w:space="0" w:color="BFBFBF"/>
+              <w:right w:val="none" w:sz="0" w:space="0" w:color="FFFFFF"/>
+            </w:tcBorders>
+            <w:tcMar>
+              <w:top w:w="50" w:type="dxa"/>
+              <w:left w:w="110" w:type="dxa"/>
+              <w:bottom w:w="50" w:type="dxa"/>
+              <w:right w:w="110" w:type="dxa"/>
+            </w:tcMar>
+            <w:vAlign w:val="center"/>
+          </w:tcPr>
+          <w:p>
+            <w:pPr>
+              <w:keepNext/>
+              <w:spacing w:after="0" w:line="240" w:lineRule="auto"/>
+            </w:pPr>
+            <w:r>
+              <w:rPr>
+                <w:sz w:val="20"/>
+                <w:szCs w:val="20"/>
+              </w:rPr>
+              <w:t>Dummy (most frequent, reference)</w:t>
+            </w:r>
+          </w:p>
+        </w:tc>
+        <w:tc>
+          <w:tcPr>
+            <w:tcW w:w="1250" w:type="dxa"/>
+            <w:tcBorders>
+              <w:top w:val="single" w:sz="4" w:space="0" w:color="BFBFBF"/>
+              <w:left w:val="none" w:sz="0" w:space="0" w:color="FFFFFF"/>
+              <w:bottom w:val="single" w:sz="4" w:space="0" w:color="BFBFBF"/>
+              <w:right w:val="none" w:sz="0" w:space="0" w:color="FFFFFF"/>
+            </w:tcBorders>
+            <w:tcMar>
+              <w:top w:w="50" w:type="dxa"/>
+              <w:left w:w="110" w:type="dxa"/>
+              <w:bottom w:w="50" w:type="dxa"/>
+              <w:right w:w="110" w:type="dxa"/>
+            </w:tcMar>
+            <w:vAlign w:val="center"/>
+          </w:tcPr>
+          <w:p>
+            <w:pPr>
+              <w:keepNext/>
+              <w:spacing w:after="0" w:line="240" w:lineRule="auto"/>
+              <w:jc w:val="center"/>
+            </w:pPr>
+            <w:r>
+              <w:rPr>
+                <w:sz w:val="20"/>
+                <w:szCs w:val="20"/>
+              </w:rPr>
+              <w:t>0.264</w:t>
+            </w:r>
+          </w:p>
+        </w:tc>
+        <w:tc>
+          <w:tcPr>
+            <w:tcW w:w="1250" w:type="dxa"/>
+            <w:tcBorders>
+              <w:top w:val="single" w:sz="4" w:space="0" w:color="BFBFBF"/>
+              <w:left w:val="none" w:sz="0" w:space="0" w:color="FFFFFF"/>
+              <w:bottom w:val="single" w:sz="4" w:space="0" w:color="BFBFBF"/>
+              <w:right w:val="none" w:sz="0" w:space="0" w:color="FFFFFF"/>
+            </w:tcBorders>
+            <w:tcMar>
+              <w:top w:w="50" w:type="dxa"/>
+              <w:left w:w="110" w:type="dxa"/>
+              <w:bottom w:w="50" w:type="dxa"/>
+              <w:right w:w="110" w:type="dxa"/>
+            </w:tcMar>
+            <w:vAlign w:val="center"/>
+          </w:tcPr>
+          <w:p>
+            <w:pPr>
+              <w:keepNext/>
+              <w:spacing w:after="0" w:line="240" w:lineRule="auto"/>
+              <w:jc w:val="center"/>
+            </w:pPr>
+            <w:r>
+              <w:rPr>
+                <w:sz w:val="20"/>
+                <w:szCs w:val="20"/>
+              </w:rPr>
+              <w:t>0.066</w:t>
+            </w:r>
+          </w:p>
+        </w:tc>
+        <w:tc>
+          <w:tcPr>
+            <w:tcW w:w="1250" w:type="dxa"/>
+            <w:tcBorders>
+              <w:top w:val="single" w:sz="4" w:space="0" w:color="BFBFBF"/>
+              <w:left w:val="none" w:sz="0" w:space="0" w:color="FFFFFF"/>
+              <w:bottom w:val="single" w:sz="4" w:space="0" w:color="BFBFBF"/>
+              <w:right w:val="none" w:sz="0" w:space="0" w:color="FFFFFF"/>
+            </w:tcBorders>
+            <w:tcMar>
+              <w:top w:w="50" w:type="dxa"/>
+              <w:left w:w="110" w:type="dxa"/>
+              <w:bottom w:w="50" w:type="dxa"/>
+              <w:right w:w="110" w:type="dxa"/>
+            </w:tcMar>
+            <w:vAlign w:val="center"/>
+          </w:tcPr>
+          <w:p>
+            <w:pPr>
+              <w:keepNext/>
+              <w:spacing w:after="0" w:line="240" w:lineRule="auto"/>
+              <w:jc w:val="center"/>
+            </w:pPr>
+            <w:r>
+              <w:rPr>
+                <w:sz w:val="20"/>
+                <w:szCs w:val="20"/>
+              </w:rPr>
+              <w:t>0.250</w:t>
+            </w:r>
+          </w:p>
+        </w:tc>
+        <w:tc>
+          <w:tcPr>
+            <w:tcW w:w="1250" w:type="dxa"/>
+            <w:tcBorders>
+              <w:top w:val="single" w:sz="4" w:space="0" w:color="BFBFBF"/>
+              <w:left w:val="none" w:sz="0" w:space="0" w:color="FFFFFF"/>
+              <w:bottom w:val="single" w:sz="4" w:space="0" w:color="BFBFBF"/>
+              <w:right w:val="none" w:sz="0" w:space="0" w:color="FFFFFF"/>
+            </w:tcBorders>
+            <w:tcMar>
+              <w:top w:w="50" w:type="dxa"/>
+              <w:left w:w="110" w:type="dxa"/>
+              <w:bottom w:w="50" w:type="dxa"/>
+              <w:right w:w="110" w:type="dxa"/>
+            </w:tcMar>
+            <w:vAlign w:val="center"/>
+          </w:tcPr>
+          <w:p>
+            <w:pPr>
+              <w:keepNext/>
+              <w:spacing w:after="0" w:line="240" w:lineRule="auto"/>
+              <w:jc w:val="center"/>
+            </w:pPr>
+            <w:r>
+              <w:rPr>
+                <w:sz w:val="20"/>
+                <w:szCs w:val="20"/>
+              </w:rPr>
+              <w:t>0.104</w:t>
+            </w:r>
+          </w:p>
+        </w:tc>
+      </w:tr>
+      <w:tr>
+        <w:trPr>
+          <w:cantSplit/>
+          <w:jc w:val="center"/>
+        </w:trPr>
+        <w:tc>
+          <w:tcPr>
+            <w:tcW w:w="3100" w:type="dxa"/>
+            <w:tcBorders>
+              <w:top w:val="single" w:sz="4" w:space="0" w:color="BFBFBF"/>
+              <w:left w:val="none" w:sz="0" w:space="0" w:color="FFFFFF"/>
+              <w:bottom w:val="single" w:sz="4" w:space="0" w:color="BFBFBF"/>
+              <w:right w:val="none" w:sz="0" w:space="0" w:color="FFFFFF"/>
+            </w:tcBorders>
+            <w:tcMar>
+              <w:top w:w="50" w:type="dxa"/>
+              <w:left w:w="110" w:type="dxa"/>
+              <w:bottom w:w="50" w:type="dxa"/>
+              <w:right w:w="110" w:type="dxa"/>
+            </w:tcMar>
+            <w:vAlign w:val="center"/>
+          </w:tcPr>
+          <w:p>
+            <w:pPr>
+              <w:keepNext/>
+              <w:spacing w:after="0" w:line="240" w:lineRule="auto"/>
+            </w:pPr>
+            <w:r>
+              <w:rPr>
+                <w:sz w:val="20"/>
+                <w:szCs w:val="20"/>
+              </w:rPr>
+              <w:t>Logistic Regression (tuned, C = 10)</w:t>
+            </w:r>
+          </w:p>
+        </w:tc>
+        <w:tc>
+          <w:tcPr>
+            <w:tcW w:w="1250" w:type="dxa"/>
+            <w:tcBorders>
+              <w:top w:val="single" w:sz="4" w:space="0" w:color="BFBFBF"/>
+              <w:left w:val="none" w:sz="0" w:space="0" w:color="FFFFFF"/>
+              <w:bottom w:val="single" w:sz="4" w:space="0" w:color="BFBFBF"/>
+              <w:right w:val="none" w:sz="0" w:space="0" w:color="FFFFFF"/>
+            </w:tcBorders>
+            <w:tcMar>
+              <w:top w:w="50" w:type="dxa"/>
+              <w:left w:w="110" w:type="dxa"/>
+              <w:bottom w:w="50" w:type="dxa"/>
+              <w:right w:w="110" w:type="dxa"/>
+            </w:tcMar>
+            <w:vAlign w:val="center"/>
+          </w:tcPr>
+          <w:p>
+            <w:pPr>
+              <w:keepNext/>
+              <w:spacing w:after="0" w:line="240" w:lineRule="auto"/>
+              <w:jc w:val="center"/>
+            </w:pPr>
+            <w:r>
+              <w:rPr>
+                <w:sz w:val="20"/>
+                <w:szCs w:val="20"/>
+              </w:rPr>
+              <w:t>0.576</w:t>
+            </w:r>
+          </w:p>
+        </w:tc>
+        <w:tc>
+          <w:tcPr>
+            <w:tcW w:w="1250" w:type="dxa"/>
+            <w:tcBorders>
+              <w:top w:val="single" w:sz="4" w:space="0" w:color="BFBFBF"/>
+              <w:left w:val="none" w:sz="0" w:space="0" w:color="FFFFFF"/>
+              <w:bottom w:val="single" w:sz="4" w:space="0" w:color="BFBFBF"/>
+              <w:right w:val="none" w:sz="0" w:space="0" w:color="FFFFFF"/>
+            </w:tcBorders>
+            <w:tcMar>
+              <w:top w:w="50" w:type="dxa"/>
+              <w:left w:w="110" w:type="dxa"/>
+              <w:bottom w:w="50" w:type="dxa"/>
+              <w:right w:w="110" w:type="dxa"/>
+            </w:tcMar>
+            <w:vAlign w:val="center"/>
+          </w:tcPr>
+          <w:p>
+            <w:pPr>
+              <w:keepNext/>
+              <w:spacing w:after="0" w:line="240" w:lineRule="auto"/>
+              <w:jc w:val="center"/>
+            </w:pPr>
+            <w:r>
+              <w:rPr>
+                <w:sz w:val="20"/>
+                <w:szCs w:val="20"/>
+              </w:rPr>
+              <w:t>0.562</w:t>
+            </w:r>
+          </w:p>
+        </w:tc>
+        <w:tc>
+          <w:tcPr>
+            <w:tcW w:w="1250" w:type="dxa"/>
+            <w:tcBorders>
+              <w:top w:val="single" w:sz="4" w:space="0" w:color="BFBFBF"/>
+              <w:left w:val="none" w:sz="0" w:space="0" w:color="FFFFFF"/>
+              <w:bottom w:val="single" w:sz="4" w:space="0" w:color="BFBFBF"/>
+              <w:right w:val="none" w:sz="0" w:space="0" w:color="FFFFFF"/>
+            </w:tcBorders>
+            <w:tcMar>
+              <w:top w:w="50" w:type="dxa"/>
+              <w:left w:w="110" w:type="dxa"/>
+              <w:bottom w:w="50" w:type="dxa"/>
+              <w:right w:w="110" w:type="dxa"/>
+            </w:tcMar>
+            <w:vAlign w:val="center"/>
+          </w:tcPr>
+          <w:p>
+            <w:pPr>
+              <w:keepNext/>
+              <w:spacing w:after="0" w:line="240" w:lineRule="auto"/>
+              <w:jc w:val="center"/>
+            </w:pPr>
+            <w:r>
+              <w:rPr>
+                <w:sz w:val="20"/>
+                <w:szCs w:val="20"/>
+              </w:rPr>
+              <w:t>0.571</w:t>
+            </w:r>
+          </w:p>
+        </w:tc>
+        <w:tc>
+          <w:tcPr>
+            <w:tcW w:w="1250" w:type="dxa"/>
+            <w:tcBorders>
+              <w:top w:val="single" w:sz="4" w:space="0" w:color="BFBFBF"/>
+              <w:left w:val="none" w:sz="0" w:space="0" w:color="FFFFFF"/>
+              <w:bottom w:val="single" w:sz="4" w:space="0" w:color="BFBFBF"/>
+              <w:right w:val="none" w:sz="0" w:space="0" w:color="FFFFFF"/>
+            </w:tcBorders>
+            <w:tcMar>
+              <w:top w:w="50" w:type="dxa"/>
+              <w:left w:w="110" w:type="dxa"/>
+              <w:bottom w:w="50" w:type="dxa"/>
+              <w:right w:w="110" w:type="dxa"/>
+            </w:tcMar>
+            <w:vAlign w:val="center"/>
+          </w:tcPr>
+          <w:p>
+            <w:pPr>
+              <w:keepNext/>
+              <w:spacing w:after="0" w:line="240" w:lineRule="auto"/>
+              <w:jc w:val="center"/>
+            </w:pPr>
+            <w:r>
+              <w:rPr>
+                <w:sz w:val="20"/>
+                <w:szCs w:val="20"/>
+              </w:rPr>
+              <w:t>0.563</w:t>
+            </w:r>
+          </w:p>
+        </w:tc>
+      </w:tr>
+      <w:tr>
+        <w:trPr>
+          <w:cantSplit/>
+          <w:jc w:val="center"/>
+        </w:trPr>
+        <w:tc>
+          <w:tcPr>
+            <w:tcW w:w="3100" w:type="dxa"/>
+            <w:tcBorders>
+              <w:top w:val="single" w:sz="4" w:space="0" w:color="BFBFBF"/>
+              <w:left w:val="none" w:sz="0" w:space="0" w:color="FFFFFF"/>
+              <w:bottom w:val="single" w:sz="4" w:space="0" w:color="BFBFBF"/>
+              <w:right w:val="none" w:sz="0" w:space="0" w:color="FFFFFF"/>
+            </w:tcBorders>
+            <w:tcMar>
+              <w:top w:w="50" w:type="dxa"/>
+              <w:left w:w="110" w:type="dxa"/>
+              <w:bottom w:w="50" w:type="dxa"/>
+              <w:right w:w="110" w:type="dxa"/>
+            </w:tcMar>
+            <w:vAlign w:val="center"/>
+          </w:tcPr>
+          <w:p>
+            <w:pPr>
+              <w:keepNext/>
+              <w:spacing w:after="0" w:line="240" w:lineRule="auto"/>
+            </w:pPr>
+            <w:r>
+              <w:rPr>
+                <w:sz w:val="20"/>
+                <w:szCs w:val="20"/>
+              </w:rPr>
+              <w:t>Random Forest (tuned)</w:t>
+            </w:r>
+          </w:p>
+        </w:tc>
+        <w:tc>
+          <w:tcPr>
+            <w:tcW w:w="1250" w:type="dxa"/>
+            <w:tcBorders>
+              <w:top w:val="single" w:sz="4" w:space="0" w:color="BFBFBF"/>
+              <w:left w:val="none" w:sz="0" w:space="0" w:color="FFFFFF"/>
+              <w:bottom w:val="single" w:sz="4" w:space="0" w:color="BFBFBF"/>
+              <w:right w:val="none" w:sz="0" w:space="0" w:color="FFFFFF"/>
+            </w:tcBorders>
+            <w:tcMar>
+              <w:top w:w="50" w:type="dxa"/>
+              <w:left w:w="110" w:type="dxa"/>
+              <w:bottom w:w="50" w:type="dxa"/>
+              <w:right w:w="110" w:type="dxa"/>
+            </w:tcMar>
+            <w:vAlign w:val="center"/>
+          </w:tcPr>
+          <w:p>
+            <w:pPr>
+              <w:keepNext/>
+              <w:spacing w:after="0" w:line="240" w:lineRule="auto"/>
+              <w:jc w:val="center"/>
+            </w:pPr>
+            <w:r>
+              <w:rPr>
+                <w:b/>
+                <w:bCs/>
+                <w:sz w:val="20"/>
+                <w:szCs w:val="20"/>
+              </w:rPr>
+              <w:t>0.642</w:t>
+            </w:r>
+          </w:p>
+        </w:tc>
+        <w:tc>
+          <w:tcPr>
+            <w:tcW w:w="1250" w:type="dxa"/>
+            <w:tcBorders>
+              <w:top w:val="single" w:sz="4" w:space="0" w:color="BFBFBF"/>
+              <w:left w:val="none" w:sz="0" w:space="0" w:color="FFFFFF"/>
+              <w:bottom w:val="single" w:sz="4" w:space="0" w:color="BFBFBF"/>
+              <w:right w:val="none" w:sz="0" w:space="0" w:color="FFFFFF"/>
+            </w:tcBorders>
+            <w:tcMar>
+              <w:top w:w="50" w:type="dxa"/>
+              <w:left w:w="110" w:type="dxa"/>
+              <w:bottom w:w="50" w:type="dxa"/>
+              <w:right w:w="110" w:type="dxa"/>
+            </w:tcMar>
+            <w:vAlign w:val="center"/>
+          </w:tcPr>
+          <w:p>
+            <w:pPr>
+              <w:keepNext/>
+              <w:spacing w:after="0" w:line="240" w:lineRule="auto"/>
+              <w:jc w:val="center"/>
+            </w:pPr>
+            <w:r>
+              <w:rPr>
+                <w:b/>
+                <w:bCs/>
+                <w:sz w:val="20"/>
+                <w:szCs w:val="20"/>
+              </w:rPr>
+              <w:t>0.638</w:t>
+            </w:r>
+          </w:p>
+        </w:tc>
+        <w:tc>
+          <w:tcPr>
+            <w:tcW w:w="1250" w:type="dxa"/>
+            <w:tcBorders>
+              <w:top w:val="single" w:sz="4" w:space="0" w:color="BFBFBF"/>
+              <w:left w:val="none" w:sz="0" w:space="0" w:color="FFFFFF"/>
+              <w:bottom w:val="single" w:sz="4" w:space="0" w:color="BFBFBF"/>
+              <w:right w:val="none" w:sz="0" w:space="0" w:color="FFFFFF"/>
+            </w:tcBorders>
+            <w:tcMar>
+              <w:top w:w="50" w:type="dxa"/>
+              <w:left w:w="110" w:type="dxa"/>
+              <w:bottom w:w="50" w:type="dxa"/>
+              <w:right w:w="110" w:type="dxa"/>
+            </w:tcMar>
+            <w:vAlign w:val="center"/>
+          </w:tcPr>
+          <w:p>
+            <w:pPr>
+              <w:keepNext/>
+              <w:spacing w:after="0" w:line="240" w:lineRule="auto"/>
+              <w:jc w:val="center"/>
+            </w:pPr>
+            <w:r>
+              <w:rPr>
+                <w:b/>
+                <w:bCs/>
+                <w:sz w:val="20"/>
+                <w:szCs w:val="20"/>
+              </w:rPr>
+              <w:t>0.639</w:t>
+            </w:r>
+          </w:p>
+        </w:tc>
+        <w:tc>
+          <w:tcPr>
+            <w:tcW w:w="1250" w:type="dxa"/>
+            <w:tcBorders>
+              <w:top w:val="single" w:sz="4" w:space="0" w:color="BFBFBF"/>
+              <w:left w:val="none" w:sz="0" w:space="0" w:color="FFFFFF"/>
+              <w:bottom w:val="single" w:sz="4" w:space="0" w:color="BFBFBF"/>
+              <w:right w:val="none" w:sz="0" w:space="0" w:color="FFFFFF"/>
+            </w:tcBorders>
+            <w:tcMar>
+              <w:top w:w="50" w:type="dxa"/>
+              <w:left w:w="110" w:type="dxa"/>
+              <w:bottom w:w="50" w:type="dxa"/>
+              <w:right w:w="110" w:type="dxa"/>
+            </w:tcMar>
+            <w:vAlign w:val="center"/>
+          </w:tcPr>
+          <w:p>
+            <w:pPr>
+              <w:keepNext/>
+              <w:spacing w:after="0" w:line="240" w:lineRule="auto"/>
+              <w:jc w:val="center"/>
+            </w:pPr>
+            <w:r>
+              <w:rPr>
+                <w:b/>
+                <w:bCs/>
+                <w:sz w:val="20"/>
+                <w:szCs w:val="20"/>
+              </w:rPr>
+              <w:t>0.639</w:t>
+            </w:r>
+          </w:p>
+        </w:tc>
+      </w:tr>
+    </w:tbl>
+    <w:p>
+      <w:pPr>
+        <w:spacing w:after="60"/>
+      </w:pPr>
+    </w:p>
+    <w:p>
+      <w:r>
+        <w:t xml:space="preserve">The test results are very close to the cross-validation results (accuracy 0.642 against 0.640 for the forest and 0.576 against 0.581 for logistic regression), so the choice we made with cross-validation also holds for new listings. With four classes, 64% may not sound very high, but most of the mistakes are near misses: 81% of the wrong predictions of the tuned forest are only one class away from the right one, for example High predicted as Luxury (78% for logistic regression). We come back to this in section 4. On the training data the tuned logistic regression gets 59.0% accuracy and the tuned forest 82.1%, against 57.6% and 64.2% on the test set, so even with min_samples_leaf = 3 the forest still overfits, but its test score is clearly the best.</w:t>
       </w:r>
     </w:p>
     <w:p>
@@ -1336,7 +2068,7 @@
     </w:p>
     <w:p>
       <w:r>
-        <w:t>Figure 2 shows the confusion matrices of the two tuned models. Each row shows where the cars of one true class ended up, so the diagonal is the share of each class that was classified correctly, which is the recall of that class. Normalising every row like this is the error analysis Géron (2019, ch. 3) recommends, because it makes the classes comparable no matter how large they are. Table 2 gives the recall and the F1 score of every class.</w:t>
+        <w:t>Figure 2 shows the confusion matrices of the two tuned models. Each row shows where the cars of one true class ended up, so the diagonal is the share of each class that was classified correctly, which is the recall of that class. Normalising every row like this is the error analysis Géron (2019, ch. 3) recommends, because it makes the classes comparable no matter how large they are. Table 3 gives the recall and the F1 score of every class.</w:t>
       </w:r>
     </w:p>
     <w:p>
@@ -1411,7 +2143,7 @@
     </w:p>
     <w:p>
       <w:r>
-        <w:t>The middle classes are much harder, and High is the hardest of all. Logistic regression only finds 32% of the High cars and puts 43% of them in Luxury instead, so its F1 score for High is just 0.36. It predicts Luxury too often in general: for the untuned model the recall of Luxury is 0.70 but its precision only 0.55 (notebook section 5). The random forest is much better here and finds 51% of the High cars (F1 0.52), but 26% of them still end up as Luxury and 19% as Medium. Medium lies in between: both models mix it up with both of its neighbours, Low and High.</w:t>
+        <w:t>The middle classes are much harder, and High is the hardest of all. Logistic regression only finds 32% of the High cars and puts 43% of them in Luxury instead, so its F1 score for High is just 0.36. It predicts Luxury too often in general: in cross-validation the recall of Luxury is 0.72 but its precision only 0.56 (notebook section 5). The random forest is much better here and finds 51% of the High cars (F1 0.52), but 26% of them still end up as Luxury and 19% as Medium. Medium lies in between: both models mix it up with both of its neighbours, Low and High.</w:t>
       </w:r>
     </w:p>
     <w:p>
@@ -1423,8 +2155,7 @@
           <w:b/>
           <w:bCs/>
         </w:rPr>
-        <w:lastRenderedPageBreak/>
-        <w:t xml:space="preserve">Table 2. </w:t>
+        <w:t xml:space="preserve">Table 3. </w:t>
       </w:r>
       <w:r>
         <w:t>Recall and F1 score per class on the test set for the two tuned models (LR = logistic regression, RF = random forest).</w:t>
@@ -2388,11 +3119,7 @@
     </w:p>
     <w:p>
       <w:r>
-        <w:t xml:space="preserve">Logistic regression is fast to train (a few seconds) and easy to interpret, because every feature gets one weight per class, and through the softmax function it gives a probability for each class. It is also </w:t>
-      </w:r>
-      <w:r>
-        <w:lastRenderedPageBreak/>
-        <w:t>very stable, with almost no difference between the training and the test results or between the cross-validation folds. Its weakness is that its decision boundaries are linear, so every feature adds a fixed amount to the score of each class. It can’t learn combinations like “this brand is Luxury only when the car is new and has few miles”, and that is exactly what is needed to separate High from Luxury. Tuning C doesn’t change that.</w:t>
+        <w:t xml:space="preserve">Logistic regression is fast to train (a few seconds) and easy to interpret, because every feature gets one weight per class, and through the softmax function it gives a probability for each class. It is also very stable, with almost no difference between the training and the test results or between the cross-validation folds. Its weakness is that its decision boundaries are linear, so every feature adds a fixed amount to the score of each class. It can’t learn combinations like “this brand is Luxury only when the car is new and has few miles”, and that is exactly what is needed to separate High from Luxury. Tuning C doesn’t change that.</w:t>
       </w:r>
     </w:p>
     <w:p>
@@ -2416,18 +3143,8 @@
     <w:p>
       <w:r>
         <w:t>Our results have some limitations. We only used 40,000 of the 240,927 listings, and we left out the model name and the dealer city, which probably say a lot about the price but have thousands of different values. The class is also relative to the car type, which the features can only partly describe. With more time we would train on the full data, add the mo</w:t>
-      </w:r>
-      <w:r>
         <w:tab/>
-      </w:r>
-      <w:r>
-        <w:t xml:space="preserve">del name with the rare models grouped together, and try gradient boosting. Since the classes have a natural order (Low, Medium, High, Luxury), it would also be worth trying an ordinal </w:t>
-      </w:r>
-      <w:r>
-        <w:t>method or</w:t>
-      </w:r>
-      <w:r>
-        <w:t xml:space="preserve"> at least reporting how often the prediction is within one class, because predicting High instead of Luxury is a much smaller mistake than predicting Low.</w:t>
+        <w:t xml:space="preserve">del name with the rare models grouped together, and try gradient boosting. Since the classes have a natural order (Low, Medium, High, Luxury), it would also be worth trying an ordinal method or at least reporting how often the prediction is within one class, because predicting High instead of Luxury is a much smaller mistake than predicting Low.</w:t>
       </w:r>
     </w:p>
     <w:p>

</xml_diff>